<commit_message>
feat: change hyper parameter pixel_density
</commit_message>
<xml_diff>
--- a/output_results/Thuc-vat-duoc_result/Thuc-vat-duoc_p80-90.docx
+++ b/output_results/Thuc-vat-duoc_result/Thuc-vat-duoc_p80-90.docx
@@ -1650,55 +1650,6 @@
     <w:p>
       <w:r>
         <w:t>1. Mô tả được các phần của lá và hình dạng lá.</w:t>
-      </w:r>
-    </w:p>
-    <w:p>
-      <w:r>
-        <w:drawing>
-          <wp:inline xmlns:a="http://schemas.openxmlformats.org/drawingml/2006/main" xmlns:pic="http://schemas.openxmlformats.org/drawingml/2006/picture">
-            <wp:extent cx="4572000" cy="1934034"/>
-            <wp:docPr id="3" name="Picture 3"/>
-            <wp:cNvGraphicFramePr>
-              <a:graphicFrameLocks noChangeAspect="1"/>
-            </wp:cNvGraphicFramePr>
-            <a:graphic>
-              <a:graphicData uri="http://schemas.openxmlformats.org/drawingml/2006/picture">
-                <pic:pic>
-                  <pic:nvPicPr>
-                    <pic:cNvPr id="0" name="p89_img1.jpg"/>
-                    <pic:cNvPicPr/>
-                  </pic:nvPicPr>
-                  <pic:blipFill>
-                    <a:blip r:embed="rId11"/>
-                    <a:stretch>
-                      <a:fillRect/>
-                    </a:stretch>
-                  </pic:blipFill>
-                  <pic:spPr>
-                    <a:xfrm>
-                      <a:off x="0" y="0"/>
-                      <a:ext cx="4572000" cy="1934034"/>
-                    </a:xfrm>
-                    <a:prstGeom prst="rect"/>
-                  </pic:spPr>
-                </pic:pic>
-              </a:graphicData>
-            </a:graphic>
-          </wp:inline>
-        </w:drawing>
-      </w:r>
-    </w:p>
-    <w:p>
-      <w:pPr>
-        <w:jc w:val="center"/>
-      </w:pPr>
-      <w:r>
-        <w:rPr>
-          <w:i/>
-          <w:color w:val="0000FF"/>
-          <w:sz w:val="20"/>
-        </w:rPr>
-        <w:t>[IMG-ID: p89_img1.jpg]</w:t>
       </w:r>
     </w:p>
     <w:p>

</xml_diff>